<commit_message>
Phase 7 Complete: Persistent Identity Profile (PIP - Novelty 3), profile save/load, PGL & CADE wiring, reset shortcut, and updated reports
</commit_message>
<xml_diff>
--- a/Adaptense_Detailed_Project_Report.docx
+++ b/Adaptense_Detailed_Project_Report.docx
@@ -69,7 +69,7 @@
               <w:rPr>
                 <w:sz w:val="19"/>
               </w:rPr>
-              <w:t>Adaptense v1.0 (Phases 1 - 6 Completed)</w:t>
+              <w:t>Adaptense v1.0 (Phases 1 - 7 Completed)</w:t>
             </w:r>
           </w:p>
         </w:tc>
@@ -194,7 +194,7 @@
         <w:spacing w:after="120"/>
       </w:pPr>
       <w:r>
-        <w:t>Adaptense is an intelligent, vision-based Human-Computer Interaction (HCI) and virtual learning environment built inside Unity 2021.3 LTS, leveraging Google MediaPipe for real-time webcam hand tracking. Unlike conventional static gesture interfaces that rigidly expect perfect user mechanics, Adaptense incorporates two major scientific novelties: (1) an adaptive, multi-modal Context-Aware Decision Engine, and (2) Progressive Gesture Learning (PGL).</w:t>
+        <w:t>Adaptense is an intelligent, vision-based Human-Computer Interaction (HCI) and virtual learning environment built inside Unity 2021.3 LTS, leveraging Google MediaPipe for real-time webcam hand tracking. Unlike conventional static gesture interfaces that rigidly expect perfect user mechanics, Adaptense incorporates three major scientific novelties: (1) an adaptive, multi-modal Context-Aware Decision Engine (CADE), (2) Progressive Gesture Learning (PGL), and (3) Persistent Identity Profile (PIP) for cross-session learner progress and sensitivity persistence.</w:t>
       </w:r>
     </w:p>
     <w:p>
@@ -254,6 +254,21 @@
       </w:r>
       <w:r>
         <w:t>Structure gesture acquisition into 5 progressive levels, gating complex actions until fundamental gestures and navigation tasks are mastered.</w:t>
+      </w:r>
+    </w:p>
+    <w:p>
+      <w:pPr>
+        <w:pStyle w:val="ListBullet"/>
+        <w:spacing w:after="60"/>
+      </w:pPr>
+      <w:r>
+        <w:rPr>
+          <w:b/>
+        </w:rPr>
+        <w:t xml:space="preserve">Persistent Identity Profile - PIP (Novelty 3): </w:t>
+      </w:r>
+      <w:r>
+        <w:t>Maintain learner profile state (unlocked levels, gesture sensitivity tolerance, task completion counters, session statistics) across app restarts using lightweight JSON persistence.</w:t>
       </w:r>
     </w:p>
     <w:p>
@@ -1646,6 +1661,41 @@
     <w:p>
       <w:pPr>
         <w:keepNext/>
+        <w:spacing w:before="240" w:after="80"/>
+      </w:pPr>
+      <w:r>
+        <w:rPr>
+          <w:b/>
+          <w:color w:val="3565A9"/>
+          <w:sz w:val="26"/>
+        </w:rPr>
+        <w:t>Novelty 3: Persistent Identity Profile (PIP)</w:t>
+      </w:r>
+    </w:p>
+    <w:p>
+      <w:r>
+        <w:t>Standard vision-based learning environments reset user state upon application closure, requiring learners to re-learn gesture controls and repeat introductory progression levels every session. The Persistent Identity Profile (PIP) subsystem introduces persistent data management designed specifically for gesture-driven HCI:</w:t>
+      </w:r>
+    </w:p>
+    <w:p>
+      <w:r>
+        <w:t>• Cross-Session Level &amp; Task Persistence: Automatically restores the learner's active PGL level (1-5) and per-level task progress flags upon app launch.</w:t>
+        <w:br/>
+        <w:t>• Learner-Specific Sensitivity Tolerance: Persists personalized gesture sensitivity values (0.0 - 1.0) and maps them to CADE confidence threshold bounds (0.40 - 0.90).</w:t>
+        <w:br/>
+        <w:t>• Lightweight Non-Blocking Storage: Utilizes native JsonUtility serialization to write JSON user profiles to Application.persistentDataPath without external package dependencies.</w:t>
+        <w:br/>
+        <w:t>• Immediate Reset Capability: Includes a fail-safe demo reset mechanism (2-second holding shortcut) to instantaneously purge saved JSON state and revert to Level 1 in memory.</w:t>
+      </w:r>
+    </w:p>
+    <w:p>
+      <w:pPr>
+        <w:spacing w:after="200"/>
+      </w:pPr>
+    </w:p>
+    <w:p>
+      <w:pPr>
+        <w:keepNext/>
         <w:spacing w:before="360" w:after="120"/>
       </w:pPr>
       <w:r>

</xml_diff>

<commit_message>
Add Live Demonstration Script & Viva Presentation Guide to project reports
</commit_message>
<xml_diff>
--- a/Adaptense_Detailed_Project_Report.docx
+++ b/Adaptense_Detailed_Project_Report.docx
@@ -2790,21 +2790,6 @@
         <w:rPr>
           <w:b/>
         </w:rPr>
-        <w:t xml:space="preserve">Phase 7: Progressive Profile Persistence (PIP): </w:t>
-      </w:r>
-      <w:r>
-        <w:t>Serialize user level progression, adaptation statistics, and custom gesture calibrations into persistent JSON / PlayerPrefs profile storage.</w:t>
-      </w:r>
-    </w:p>
-    <w:p>
-      <w:pPr>
-        <w:pStyle w:val="ListBullet"/>
-        <w:spacing w:after="80"/>
-      </w:pPr>
-      <w:r>
-        <w:rPr>
-          <w:b/>
-        </w:rPr>
         <w:t xml:space="preserve">Multi-Hand Bi-Manual Manipulation: </w:t>
       </w:r>
       <w:r>
@@ -2835,10 +2820,184 @@
         <w:rPr>
           <w:b/>
         </w:rPr>
-        <w:t xml:space="preserve">Standalone Build &amp; WebGL / OpenXR Export: </w:t>
+        <w:t xml:space="preserve">Spatial Headset Export (OpenXR): </w:t>
       </w:r>
       <w:r>
-        <w:t>Compile standalone executable (.exe) and investigate WebAssembly / OpenXR deployment for spatial headsets (Apple Vision Pro, Meta Quest 3).</w:t>
+        <w:t>Compile standalone WebGL / OpenXR builds for spatial computing devices (Meta Quest 3, Apple Vision Pro).</w:t>
+      </w:r>
+    </w:p>
+    <w:p>
+      <w:pPr>
+        <w:spacing w:after="200"/>
+      </w:pPr>
+    </w:p>
+    <w:p>
+      <w:pPr>
+        <w:keepNext/>
+        <w:spacing w:before="360" w:after="120"/>
+      </w:pPr>
+      <w:r>
+        <w:rPr>
+          <w:b/>
+          <w:color w:val="102C57"/>
+          <w:sz w:val="32"/>
+        </w:rPr>
+        <w:t>9. Live Demonstration Script &amp; Viva Presentation Guide</w:t>
+      </w:r>
+    </w:p>
+    <w:p>
+      <w:r>
+        <w:t>This step-by-step walkthrough outlines how to deliver a flawless live demonstration during project defense/viva. It highlights each core feature, novelty, visual UI reaction, and exact Unity Console log output.</w:t>
+      </w:r>
+    </w:p>
+    <w:p>
+      <w:pPr>
+        <w:keepNext/>
+        <w:spacing w:before="240" w:after="80"/>
+      </w:pPr>
+      <w:r>
+        <w:rPr>
+          <w:b/>
+          <w:color w:val="3565A9"/>
+          <w:sz w:val="26"/>
+        </w:rPr>
+        <w:t>Pre-Demo Setup</w:t>
+      </w:r>
+    </w:p>
+    <w:p>
+      <w:pPr>
+        <w:spacing w:after="120"/>
+      </w:pPr>
+      <w:r>
+        <w:rPr>
+          <w:sz w:val="20"/>
+        </w:rPr>
+        <w:t>1. Open Hand Tracking.unity in Unity 2021.3.22f1.</w:t>
+        <w:br/>
+        <w:t>2. Ensure the Console window is visible alongside the Game view.</w:t>
+        <w:br/>
+        <w:t>3. If starting fresh, hold the 'R' key for 2 seconds in Play mode to reset the profile to Level 1. Look for Console log: [PIP ProfileManager] Profile RESET to default.</w:t>
+      </w:r>
+    </w:p>
+    <w:p>
+      <w:pPr>
+        <w:keepNext/>
+        <w:spacing w:before="240" w:after="80"/>
+      </w:pPr>
+      <w:r>
+        <w:rPr>
+          <w:b/>
+          <w:color w:val="3565A9"/>
+          <w:sz w:val="26"/>
+        </w:rPr>
+        <w:t>Demonstrating Novelty 2: Progressive Gesture Learning (PGL)</w:t>
+      </w:r>
+    </w:p>
+    <w:p>
+      <w:pPr>
+        <w:spacing w:after="120"/>
+      </w:pPr>
+      <w:r>
+        <w:rPr>
+          <w:sz w:val="20"/>
+        </w:rPr>
+        <w:t>1. Level 1 (Palms Only):</w:t>
+        <w:br/>
+        <w:t xml:space="preserve">   • Perform Single Open Palm: Info Panel toggles open. Console log: [PGL Task Progress] Single Palm: Opened Info Panel.</w:t>
+        <w:br/>
+        <w:t xml:space="preserve">   • Perform Double Open Palm (within 1.4s): Level Description Modal toggles. Console log: [PGL Task Progress] Double Palm: Opened Description Modal.</w:t>
+        <w:br/>
+        <w:t xml:space="preserve">   • Watch the 4-second transition countdown modal appear, followed by toast notification: [PGL LEVEL UP!] Advanced to Level 2.</w:t>
+        <w:br/>
+        <w:t>2. Demonstrating Gesture Gating (Level 2):</w:t>
+        <w:br/>
+        <w:t xml:space="preserve">   • Perform a locked gesture (e.g., Fist or Pinch). Point out Console log: [PGL Gating] Gesture 'Fist' is LOCKED at Level 2... showing gestures are safely filtered upstream.</w:t>
+        <w:br/>
+        <w:t>3. Level 2 (Select &amp; Navigate):</w:t>
+        <w:br/>
+        <w:t xml:space="preserve">   • Point finger at 2 distinct 3D objects (Beaker, Book). Watch cyan outline &amp; floating label appear.</w:t>
+        <w:br/>
+        <w:t xml:space="preserve">   • Swipe hand horizontally across camera (velocity &gt;= 0.45 u/s) to cycle selection. Level-up to Level 3 triggers.</w:t>
+        <w:br/>
+        <w:t>4. Level 3 &amp; Level 4 (Control &amp; Fist Move):</w:t>
+        <w:br/>
+        <w:t xml:space="preserve">   • Level 3: Pinch index &amp; thumb tips together to reset/cancel hold → Advances to Level 4.</w:t>
+        <w:br/>
+        <w:t xml:space="preserve">   • Level 4: Point to select → Make a Fist to pick up object (floats/elevates) → Make 2nd Fist over Drop Zone to place object → Advances to Level 5 (Mastery Mode 🎉).</w:t>
+      </w:r>
+    </w:p>
+    <w:p>
+      <w:pPr>
+        <w:keepNext/>
+        <w:spacing w:before="240" w:after="80"/>
+      </w:pPr>
+      <w:r>
+        <w:rPr>
+          <w:b/>
+          <w:color w:val="3565A9"/>
+          <w:sz w:val="26"/>
+        </w:rPr>
+        <w:t>Demonstrating Novelty 1: Context-Aware Decision Engine (CADE)</w:t>
+      </w:r>
+    </w:p>
+    <w:p>
+      <w:pPr>
+        <w:spacing w:after="120"/>
+      </w:pPr>
+      <w:r>
+        <w:rPr>
+          <w:sz w:val="20"/>
+        </w:rPr>
+        <w:t>1. Normal Execution:</w:t>
+        <w:br/>
+        <w:t xml:space="preserve">   • Perform gesture cleanly in good light. Point out Console: ExecuteNormally.</w:t>
+        <w:br/>
+        <w:t>2. Adaptive Tolerance (Make Interaction Easier):</w:t>
+        <w:br/>
+        <w:t xml:space="preserve">   • Cover room light slightly or step back from camera. CADE detects environmental difficulty or struggle and relaxes confidence threshold from 0.65 to 0.42. Console log: [DecisionEngine] MakeInteractionEasier =&gt; Lowered tolerance to 0.42...</w:t>
+        <w:br/>
+        <w:t>3. Visual Guidance Hints:</w:t>
+        <w:br/>
+        <w:t xml:space="preserve">   • Hold an incomplete or ambiguous pose. A cyan hint banner appears at the bottom: 'Extend index finger fully...' or 'Move hand closer to camera'.</w:t>
+        <w:br/>
+        <w:t>4. Alternative Gesture Fallback:</w:t>
+        <w:br/>
+        <w:t xml:space="preserve">   • Intentionally fail a gesture 4 consecutive times. CADE offers a yellow fallback prompt: 'Having trouble with Point? Try using Swipe instead!'</w:t>
+      </w:r>
+    </w:p>
+    <w:p>
+      <w:pPr>
+        <w:keepNext/>
+        <w:spacing w:before="240" w:after="80"/>
+      </w:pPr>
+      <w:r>
+        <w:rPr>
+          <w:b/>
+          <w:color w:val="3565A9"/>
+          <w:sz w:val="26"/>
+        </w:rPr>
+        <w:t>Demonstrating Novelty 3: Persistent Identity Profile (PIP)</w:t>
+      </w:r>
+    </w:p>
+    <w:p>
+      <w:pPr>
+        <w:spacing w:after="120"/>
+      </w:pPr>
+      <w:r>
+        <w:rPr>
+          <w:sz w:val="20"/>
+        </w:rPr>
+        <w:t>1. Cross-Session Persistence:</w:t>
+        <w:br/>
+        <w:t xml:space="preserve">   • While at Level 3 or 4, stop Play mode (exit app).</w:t>
+        <w:br/>
+        <w:t xml:space="preserve">   • Press Play again. Point out Console log on startup: [PIP ProfileManager] ===== PROFILE LOADED ===== Current Level: 4, Session Count: 2.</w:t>
+        <w:br/>
+        <w:t xml:space="preserve">   • Show that the PGL level badge, instruction banner, and task checklist restore instantly from adapter_profile.json without restarting from Level 1.</w:t>
+        <w:br/>
+        <w:t>2. Fail-Safe Reset Shortcut:</w:t>
+        <w:br/>
+        <w:t xml:space="preserve">   • Hold 'R' for 2 seconds. Watch the system immediately purge the save JSON and reset the in-memory level back to Level 1 in real-time.</w:t>
       </w:r>
     </w:p>
     <w:sectPr>

</xml_diff>